<commit_message>
Add 1부 9화 and weave Spanish historical precedents into 1–9화; update series bible
Co-Authored-By: Claude Sonnet 5.5 <noreply@anthropic.com>
Claude-Session: https://claude.ai/code/session_013X2zbh4kERceyuaxxZfq31
</commit_message>
<xml_diff>
--- a/Diplomata_ES/docx/1부1화_El_atunero_retenido.docx
+++ b/Diplomata_ES/docx/1부1화_El_atunero_retenido.docx
@@ -95,7 +95,7 @@
           <w:color w:val="555555"/>
           <w:sz w:val="20"/>
         </w:rPr>
-        <w:t>월요일 아침 마드리드 산타크루스 궁 위기대책실 → 칸다라 차관과의 통화 → 목요일 비고 항구</w:t>
+        <w:t>월요일 아침 마드리드 산타크루스 궁 위기대책실 → 칸다라 차관과의 통화 → 화요일 비고 항구</w:t>
       </w:r>
     </w:p>
     <w:p>
@@ -111,7 +111,7 @@
           <w:color w:val="555555"/>
           <w:sz w:val="19"/>
         </w:rPr>
-        <w:t>대사 161턴 · 난이도 B2-C1 · 지문 없이 대사만으로 구성 · 본문 + 한국어 대역 + 주석</w:t>
+        <w:t>대사 165턴 · 난이도 B2-C1 · 지문 없이 대사만으로 구성 · 본문 + 한국어 대역 + 주석</w:t>
       </w:r>
     </w:p>
     <w:p>
@@ -1296,7 +1296,7 @@
           <w:color w:val="8A1C2B"/>
           <w:sz w:val="21"/>
         </w:rPr>
-        <w:t xml:space="preserve">GASPAR   </w:t>
+        <w:t xml:space="preserve">ÁLVARO   </w:t>
       </w:r>
       <w:r>
         <w:rPr>
@@ -1305,7 +1305,7 @@
           <w:i w:val="0"/>
           <w:sz w:val="22"/>
         </w:rPr>
-        <w:t>La ministra habla esta tarde en el Congreso. Necesita una frase que pueda decir sin tropezar.</w:t>
+        <w:t>Hay otro precedente, señora secretaria. En mil novecientos noventa y cinco Canadá apresó al Estai, un arrastrero gallego, en aguas internacionales.</w:t>
       </w:r>
     </w:p>
     <w:p>
@@ -1321,7 +1321,7 @@
           <w:color w:val="555555"/>
           <w:sz w:val="19"/>
         </w:rPr>
-        <w:t>장관님이 오늘 오후 의회에서 발언하십니다. 걸려 넘어지지 않고 말할 수 있는 문장이 필요해요.</w:t>
+        <w:t>다른 선례도 있습니다, 차관님. 1995년에 캐나다가 국제 해역에서 갈리시아 선적 트롤선 에스타이호를 나포했죠.</w:t>
       </w:r>
     </w:p>
     <w:p>
@@ -1348,7 +1348,7 @@
           <w:color w:val="8A1C2B"/>
           <w:sz w:val="21"/>
         </w:rPr>
-        <w:t xml:space="preserve">ÁLVARO   </w:t>
+        <w:t xml:space="preserve">MARINA   </w:t>
       </w:r>
       <w:r>
         <w:rPr>
@@ -1357,7 +1357,7 @@
           <w:i w:val="0"/>
           <w:sz w:val="22"/>
         </w:rPr>
-        <w:t>Pues démosle una: «Estamos negociando la liberación inmediata de nuestros marinos». Es verdad y no nos compromete a nada.</w:t>
+        <w:t>Y España no resolvió aquello pagando lo que pedía Canadá. Lo resolvió Bruselas, con un acuerdo entre la Unión Europea y Canadá. Había observadores a bordo, y el barco volvió a Vigo.</w:t>
       </w:r>
     </w:p>
     <w:p>
@@ -1373,7 +1373,7 @@
           <w:color w:val="555555"/>
           <w:sz w:val="19"/>
         </w:rPr>
-        <w:t>그럼 한 문장 드리죠. '우리 선원들의 즉각 석방을 협상하고 있다'. 사실이고, 아무것도 약속하지 않습니다.</w:t>
+        <w:t>그리고 스페인은 캐나다가 요구한 걸 내서 해결하지 않았어요. 브뤼셀이 해결했죠. 유럽연합과 캐나다 사이의 합의로요. 배에 관측원이 승선했고, 배는 비고로 돌아왔어요.</w:t>
       </w:r>
     </w:p>
     <w:p>
@@ -1409,7 +1409,7 @@
           <w:i w:val="0"/>
           <w:sz w:val="22"/>
         </w:rPr>
-        <w:t>Me sirve. Pero que sea verdad de aquí a las cuatro.</w:t>
+        <w:t>Fue otro océano, otro país y otro Gobierno. Eso fue hace treinta años.</w:t>
       </w:r>
     </w:p>
     <w:p>
@@ -1425,7 +1425,7 @@
           <w:color w:val="555555"/>
           <w:sz w:val="19"/>
         </w:rPr>
-        <w:t>그거면 됩니다. 단, 네 시까지는 진짜 사실이어야 해요.</w:t>
+        <w:t>다른 바다, 다른 나라, 다른 정부였어요. 30년 전 일이에요.</w:t>
       </w:r>
     </w:p>
     <w:p>
@@ -1452,7 +1452,7 @@
           <w:color w:val="8A1C2B"/>
           <w:sz w:val="21"/>
         </w:rPr>
-        <w:t xml:space="preserve">VALDÉS   </w:t>
+        <w:t xml:space="preserve">ÁLVARO   </w:t>
       </w:r>
       <w:r>
         <w:rPr>
@@ -1461,7 +1461,7 @@
           <w:i w:val="0"/>
           <w:sz w:val="22"/>
         </w:rPr>
-        <w:t>Entonces ponte a ello. Llama a Puerto Alba. Hoy.</w:t>
+        <w:t>Cambia el país, no la lección: un apresamiento se resuelve cambiando el marco, no pagando la factura. Cuando uno paga la factura, acepta que la factura era justa.</w:t>
       </w:r>
     </w:p>
     <w:p>
@@ -1477,7 +1477,7 @@
           <w:color w:val="555555"/>
           <w:sz w:val="19"/>
         </w:rPr>
-        <w:t>그럼 착수하게. 푸에르토 알바에 전화해. 오늘 중으로.</w:t>
+        <w:t>나라는 바뀌어도 교훈은 같습니다. 나포는 청구서를 내서가 아니라 틀을 바꿔서 풀리죠. 청구서를 내면 그 청구서가 정당했다고 인정하는 게 됩니다.</w:t>
       </w:r>
     </w:p>
     <w:p>
@@ -1504,7 +1504,7 @@
           <w:color w:val="8A1C2B"/>
           <w:sz w:val="21"/>
         </w:rPr>
-        <w:t xml:space="preserve">ÁLVARO   </w:t>
+        <w:t xml:space="preserve">GASPAR   </w:t>
       </w:r>
       <w:r>
         <w:rPr>
@@ -1513,7 +1513,7 @@
           <w:i w:val="0"/>
           <w:sz w:val="22"/>
         </w:rPr>
-        <w:t>Con una condición: que nadie más hable con ellos mientras yo lo hago. Ni por la vía diplomática ni por la vía oficiosa.</w:t>
+        <w:t>La ministra habla esta tarde en el Congreso. Necesita una frase que pueda decir sin tropezar.</w:t>
       </w:r>
     </w:p>
     <w:p>
@@ -1529,7 +1529,7 @@
           <w:color w:val="555555"/>
           <w:sz w:val="19"/>
         </w:rPr>
-        <w:t>한 가지 조건이 있습니다. 제가 하는 동안 아무도 그쪽과 접촉하지 않을 것. 외교 경로로도, 비공식 경로로도요.</w:t>
+        <w:t>장관님이 오늘 오후 의회에서 발언하십니다. 걸려 넘어지지 않고 말할 수 있는 문장이 필요해요.</w:t>
       </w:r>
     </w:p>
     <w:p>
@@ -1556,7 +1556,7 @@
           <w:color w:val="8A1C2B"/>
           <w:sz w:val="21"/>
         </w:rPr>
-        <w:t xml:space="preserve">VALDÉS   </w:t>
+        <w:t xml:space="preserve">ÁLVARO   </w:t>
       </w:r>
       <w:r>
         <w:rPr>
@@ -1565,7 +1565,7 @@
           <w:i w:val="0"/>
           <w:sz w:val="22"/>
         </w:rPr>
-        <w:t>¿Por qué lo dices así?</w:t>
+        <w:t>Pues démosle una: «Estamos negociando la liberación inmediata de nuestros marinos». Es verdad y no nos compromete a nada.</w:t>
       </w:r>
     </w:p>
     <w:p>
@@ -1581,7 +1581,7 @@
           <w:color w:val="555555"/>
           <w:sz w:val="19"/>
         </w:rPr>
-        <w:t>왜 그렇게 말하나?</w:t>
+        <w:t>그럼 한 문장 드리죠. '우리 선원들의 즉각 석방을 협상하고 있다'. 사실이고, 아무것도 약속하지 않습니다.</w:t>
       </w:r>
     </w:p>
     <w:p>
@@ -1608,7 +1608,7 @@
           <w:color w:val="8A1C2B"/>
           <w:sz w:val="21"/>
         </w:rPr>
-        <w:t xml:space="preserve">ÁLVARO   </w:t>
+        <w:t xml:space="preserve">GASPAR   </w:t>
       </w:r>
       <w:r>
         <w:rPr>
@@ -1617,7 +1617,7 @@
           <w:i w:val="0"/>
           <w:sz w:val="22"/>
         </w:rPr>
-        <w:t>Porque cuando hay demasiadas voces, el otro lado elige la que más le conviene.</w:t>
+        <w:t>Me sirve. Pero que sea verdad de aquí a las cuatro.</w:t>
       </w:r>
     </w:p>
     <w:p>
@@ -1633,7 +1633,7 @@
           <w:color w:val="555555"/>
           <w:sz w:val="19"/>
         </w:rPr>
-        <w:t>목소리가 너무 많으면, 상대가 자기한테 가장 유리한 목소리를 고르니까요.</w:t>
+        <w:t>그거면 됩니다. 단, 네 시까지는 진짜 사실이어야 해요.</w:t>
       </w:r>
     </w:p>
     <w:p>
@@ -1669,7 +1669,7 @@
           <w:i w:val="0"/>
           <w:sz w:val="22"/>
         </w:rPr>
-        <w:t>Concedido. Tienes hasta el miércoles.</w:t>
+        <w:t>Entonces ponte a ello. Llama a Puerto Alba. Hoy.</w:t>
       </w:r>
     </w:p>
     <w:p>
@@ -1685,7 +1685,7 @@
           <w:color w:val="555555"/>
           <w:sz w:val="19"/>
         </w:rPr>
-        <w:t>받아들이겠네. 수요일까지야.</w:t>
+        <w:t>그럼 착수하게. 푸에르토 알바에 전화해. 오늘 중으로.</w:t>
       </w:r>
     </w:p>
     <w:p>
@@ -1712,7 +1712,7 @@
           <w:color w:val="8A1C2B"/>
           <w:sz w:val="21"/>
         </w:rPr>
-        <w:t xml:space="preserve">MARINA   </w:t>
+        <w:t xml:space="preserve">ÁLVARO   </w:t>
       </w:r>
       <w:r>
         <w:rPr>
@@ -1721,7 +1721,7 @@
           <w:i w:val="0"/>
           <w:sz w:val="22"/>
         </w:rPr>
-        <w:t>Álvaro, un segundo. Fuera de la sala.</w:t>
+        <w:t>Con una condición: que nadie más hable con ellos mientras yo lo hago. Ni por la vía diplomática ni por la vía oficiosa.</w:t>
       </w:r>
     </w:p>
     <w:p>
@@ -1737,7 +1737,7 @@
           <w:color w:val="555555"/>
           <w:sz w:val="19"/>
         </w:rPr>
-        <w:t>알바로, 잠깐만요. 밖에서요.</w:t>
+        <w:t>한 가지 조건이 있습니다. 제가 하는 동안 아무도 그쪽과 접촉하지 않을 것. 외교 경로로도, 비공식 경로로도요.</w:t>
       </w:r>
     </w:p>
     <w:p>
@@ -1764,7 +1764,7 @@
           <w:color w:val="8A1C2B"/>
           <w:sz w:val="21"/>
         </w:rPr>
-        <w:t xml:space="preserve">ÁLVARO   </w:t>
+        <w:t xml:space="preserve">VALDÉS   </w:t>
       </w:r>
       <w:r>
         <w:rPr>
@@ -1773,7 +1773,7 @@
           <w:i w:val="0"/>
           <w:sz w:val="22"/>
         </w:rPr>
-        <w:t>Dime.</w:t>
+        <w:t>¿Por qué lo dices así?</w:t>
       </w:r>
     </w:p>
     <w:p>
@@ -1789,7 +1789,7 @@
           <w:color w:val="555555"/>
           <w:sz w:val="19"/>
         </w:rPr>
-        <w:t>말해 봐.</w:t>
+        <w:t>왜 그렇게 말하나?</w:t>
       </w:r>
     </w:p>
     <w:p>
@@ -1816,7 +1816,7 @@
           <w:color w:val="8A1C2B"/>
           <w:sz w:val="21"/>
         </w:rPr>
-        <w:t xml:space="preserve">MARINA   </w:t>
+        <w:t xml:space="preserve">ÁLVARO   </w:t>
       </w:r>
       <w:r>
         <w:rPr>
@@ -1825,7 +1825,7 @@
           <w:i w:val="0"/>
           <w:sz w:val="22"/>
         </w:rPr>
-        <w:t>Es la tercera vez que Valdés repite «paga y calla». No es su estilo. Ella normalmente quiere entender el problema antes de resolverlo.</w:t>
+        <w:t>Porque cuando hay demasiadas voces, el otro lado elige la que más le conviene.</w:t>
       </w:r>
     </w:p>
     <w:p>
@@ -1841,7 +1841,7 @@
           <w:color w:val="555555"/>
           <w:sz w:val="19"/>
         </w:rPr>
-        <w:t>발데스 차관님이 '돈 내고 조용히 하자'를 세 번째 반복하셨어요. 그분 스타일이 아니에요. 보통은 해결하기 전에 문제부터 이해하려는 분이잖아요.</w:t>
+        <w:t>목소리가 너무 많으면, 상대가 자기한테 가장 유리한 목소리를 고르니까요.</w:t>
       </w:r>
     </w:p>
     <w:p>
@@ -1868,7 +1868,7 @@
           <w:color w:val="8A1C2B"/>
           <w:sz w:val="21"/>
         </w:rPr>
-        <w:t xml:space="preserve">ÁLVARO   </w:t>
+        <w:t xml:space="preserve">VALDÉS   </w:t>
       </w:r>
       <w:r>
         <w:rPr>
@@ -1877,7 +1877,7 @@
           <w:i w:val="0"/>
           <w:sz w:val="22"/>
         </w:rPr>
-        <w:t>Lo he notado. Apúntalo, pero no lo comentes con nadie.</w:t>
+        <w:t>Concedido. Tienes hasta el viernes.</w:t>
       </w:r>
     </w:p>
     <w:p>
@@ -1893,7 +1893,7 @@
           <w:color w:val="555555"/>
           <w:sz w:val="19"/>
         </w:rPr>
-        <w:t>나도 눈치챘어. 적어 두되, 아무한테도 말하지 마.</w:t>
+        <w:t>받아들이겠네. 금요일까지야.</w:t>
       </w:r>
     </w:p>
     <w:p>
@@ -1929,7 +1929,7 @@
           <w:i w:val="0"/>
           <w:sz w:val="22"/>
         </w:rPr>
-        <w:t>¿Ni siquiera con Berni?</w:t>
+        <w:t>Álvaro, un segundo. Fuera de la sala.</w:t>
       </w:r>
     </w:p>
     <w:p>
@@ -1945,7 +1945,7 @@
           <w:color w:val="555555"/>
           <w:sz w:val="19"/>
         </w:rPr>
-        <w:t>베르니 선생님한테도요?</w:t>
+        <w:t>알바로, 잠깐만요. 밖에서요.</w:t>
       </w:r>
     </w:p>
     <w:p>
@@ -1981,7 +1981,7 @@
           <w:i w:val="0"/>
           <w:sz w:val="22"/>
         </w:rPr>
-        <w:t>A Berni, sí. Pero en persona, no por teléfono.</w:t>
+        <w:t>Dime.</w:t>
       </w:r>
     </w:p>
     <w:p>
@@ -1997,7 +1997,7 @@
           <w:color w:val="555555"/>
           <w:sz w:val="19"/>
         </w:rPr>
-        <w:t>베르니한테는 해도 돼. 하지만 전화 말고 직접 만나서.</w:t>
+        <w:t>말해 봐.</w:t>
       </w:r>
     </w:p>
     <w:p>
@@ -2033,7 +2033,7 @@
           <w:i w:val="0"/>
           <w:sz w:val="22"/>
         </w:rPr>
-        <w:t>Entendido. ¿Y la llamada de las doce?</w:t>
+        <w:t>Es la tercera vez que Valdés repite «paga y calla». No es su estilo. Ella normalmente quiere entender el problema antes de resolverlo.</w:t>
       </w:r>
     </w:p>
     <w:p>
@@ -2049,7 +2049,7 @@
           <w:color w:val="555555"/>
           <w:sz w:val="19"/>
         </w:rPr>
-        <w:t>알겠습니다. 열두 시 통화는요?</w:t>
+        <w:t>발데스 차관님이 '돈 내고 조용히 하자'를 세 번째 반복하셨어요. 그분 스타일이 아니에요. 보통은 해결하기 전에 문제부터 이해하려는 분이잖아요.</w:t>
       </w:r>
     </w:p>
     <w:p>
@@ -2085,7 +2085,7 @@
           <w:i w:val="0"/>
           <w:sz w:val="22"/>
         </w:rPr>
-        <w:t>La hacemos desde mi despacho. Tráeme el expediente de la licencia y el acuerdo de pesca. Todo lo que haya.</w:t>
+        <w:t>Lo he notado. Apúntalo, pero no lo comentes con nadie.</w:t>
       </w:r>
     </w:p>
     <w:p>
@@ -2101,7 +2101,7 @@
           <w:color w:val="555555"/>
           <w:sz w:val="19"/>
         </w:rPr>
-        <w:t>내 사무실에서 하자. 면허 서류랑 어업협정 가져다줘. 있는 건 전부.</w:t>
+        <w:t>나도 눈치챘어. 적어 두되, 아무한테도 말하지 마.</w:t>
       </w:r>
     </w:p>
     <w:p>
@@ -2137,7 +2137,7 @@
           <w:i w:val="0"/>
           <w:sz w:val="22"/>
         </w:rPr>
-        <w:t>¿Todo todo?</w:t>
+        <w:t>¿Ni siquiera con Berni?</w:t>
       </w:r>
     </w:p>
     <w:p>
@@ -2153,7 +2153,7 @@
           <w:color w:val="555555"/>
           <w:sz w:val="19"/>
         </w:rPr>
-        <w:t>전부 다요?</w:t>
+        <w:t>베르니 선생님한테도요?</w:t>
       </w:r>
     </w:p>
     <w:p>
@@ -2189,7 +2189,7 @@
           <w:i w:val="0"/>
           <w:sz w:val="22"/>
         </w:rPr>
-        <w:t>Todo lo que esté a la vista. Y si no está a la vista, quiero saber por qué.</w:t>
+        <w:t>A Berni, sí. Pero en persona, no por teléfono.</w:t>
       </w:r>
     </w:p>
     <w:p>
@@ -2205,6 +2205,214 @@
           <w:color w:val="555555"/>
           <w:sz w:val="19"/>
         </w:rPr>
+        <w:t>베르니한테는 해도 돼. 하지만 전화 말고 직접 만나서.</w:t>
+      </w:r>
+    </w:p>
+    <w:p>
+      <w:pPr>
+        <w:keepNext/>
+        <w:spacing w:before="80" w:after="0" w:line="276" w:lineRule="auto"/>
+        <w:ind w:left="0"/>
+      </w:pPr>
+      <w:r>
+        <w:rPr>
+          <w:rFonts w:ascii="Noto Sans KR" w:hAnsi="Noto Sans KR" w:eastAsia="Noto Sans KR" w:cs="Noto Sans KR"/>
+          <w:b w:val="0"/>
+          <w:i w:val="0"/>
+          <w:color w:val="555555"/>
+          <w:sz w:val="15"/>
+        </w:rPr>
+        <w:t xml:space="preserve">036  </w:t>
+      </w:r>
+      <w:r>
+        <w:rPr>
+          <w:rFonts w:ascii="Noto Sans KR" w:hAnsi="Noto Sans KR" w:eastAsia="Noto Sans KR" w:cs="Noto Sans KR"/>
+          <w:b/>
+          <w:i w:val="0"/>
+          <w:color w:val="8A1C2B"/>
+          <w:sz w:val="21"/>
+        </w:rPr>
+        <w:t xml:space="preserve">MARINA   </w:t>
+      </w:r>
+      <w:r>
+        <w:rPr>
+          <w:rFonts w:ascii="Noto Sans KR" w:hAnsi="Noto Sans KR" w:eastAsia="Noto Sans KR" w:cs="Noto Sans KR"/>
+          <w:b w:val="0"/>
+          <w:i w:val="0"/>
+          <w:sz w:val="22"/>
+        </w:rPr>
+        <w:t>Entendido. ¿Y la llamada de las doce?</w:t>
+      </w:r>
+    </w:p>
+    <w:p>
+      <w:pPr>
+        <w:spacing w:before="0" w:after="40" w:line="276" w:lineRule="auto"/>
+        <w:ind w:left="595"/>
+      </w:pPr>
+      <w:r>
+        <w:rPr>
+          <w:rFonts w:ascii="Noto Sans KR" w:hAnsi="Noto Sans KR" w:eastAsia="Noto Sans KR" w:cs="Noto Sans KR"/>
+          <w:b w:val="0"/>
+          <w:i w:val="0"/>
+          <w:color w:val="555555"/>
+          <w:sz w:val="19"/>
+        </w:rPr>
+        <w:t>알겠습니다. 열두 시 통화는요?</w:t>
+      </w:r>
+    </w:p>
+    <w:p>
+      <w:pPr>
+        <w:keepNext/>
+        <w:spacing w:before="80" w:after="0" w:line="276" w:lineRule="auto"/>
+        <w:ind w:left="0"/>
+      </w:pPr>
+      <w:r>
+        <w:rPr>
+          <w:rFonts w:ascii="Noto Sans KR" w:hAnsi="Noto Sans KR" w:eastAsia="Noto Sans KR" w:cs="Noto Sans KR"/>
+          <w:b w:val="0"/>
+          <w:i w:val="0"/>
+          <w:color w:val="555555"/>
+          <w:sz w:val="15"/>
+        </w:rPr>
+        <w:t xml:space="preserve">037  </w:t>
+      </w:r>
+      <w:r>
+        <w:rPr>
+          <w:rFonts w:ascii="Noto Sans KR" w:hAnsi="Noto Sans KR" w:eastAsia="Noto Sans KR" w:cs="Noto Sans KR"/>
+          <w:b/>
+          <w:i w:val="0"/>
+          <w:color w:val="8A1C2B"/>
+          <w:sz w:val="21"/>
+        </w:rPr>
+        <w:t xml:space="preserve">ÁLVARO   </w:t>
+      </w:r>
+      <w:r>
+        <w:rPr>
+          <w:rFonts w:ascii="Noto Sans KR" w:hAnsi="Noto Sans KR" w:eastAsia="Noto Sans KR" w:cs="Noto Sans KR"/>
+          <w:b w:val="0"/>
+          <w:i w:val="0"/>
+          <w:sz w:val="22"/>
+        </w:rPr>
+        <w:t>La hacemos desde mi despacho. Tráeme el expediente de la licencia y el acuerdo de pesca. Todo lo que haya.</w:t>
+      </w:r>
+    </w:p>
+    <w:p>
+      <w:pPr>
+        <w:spacing w:before="0" w:after="40" w:line="276" w:lineRule="auto"/>
+        <w:ind w:left="595"/>
+      </w:pPr>
+      <w:r>
+        <w:rPr>
+          <w:rFonts w:ascii="Noto Sans KR" w:hAnsi="Noto Sans KR" w:eastAsia="Noto Sans KR" w:cs="Noto Sans KR"/>
+          <w:b w:val="0"/>
+          <w:i w:val="0"/>
+          <w:color w:val="555555"/>
+          <w:sz w:val="19"/>
+        </w:rPr>
+        <w:t>내 사무실에서 하자. 면허 서류랑 어업협정 가져다줘. 있는 건 전부.</w:t>
+      </w:r>
+    </w:p>
+    <w:p>
+      <w:pPr>
+        <w:keepNext/>
+        <w:spacing w:before="80" w:after="0" w:line="276" w:lineRule="auto"/>
+        <w:ind w:left="0"/>
+      </w:pPr>
+      <w:r>
+        <w:rPr>
+          <w:rFonts w:ascii="Noto Sans KR" w:hAnsi="Noto Sans KR" w:eastAsia="Noto Sans KR" w:cs="Noto Sans KR"/>
+          <w:b w:val="0"/>
+          <w:i w:val="0"/>
+          <w:color w:val="555555"/>
+          <w:sz w:val="15"/>
+        </w:rPr>
+        <w:t xml:space="preserve">038  </w:t>
+      </w:r>
+      <w:r>
+        <w:rPr>
+          <w:rFonts w:ascii="Noto Sans KR" w:hAnsi="Noto Sans KR" w:eastAsia="Noto Sans KR" w:cs="Noto Sans KR"/>
+          <w:b/>
+          <w:i w:val="0"/>
+          <w:color w:val="8A1C2B"/>
+          <w:sz w:val="21"/>
+        </w:rPr>
+        <w:t xml:space="preserve">MARINA   </w:t>
+      </w:r>
+      <w:r>
+        <w:rPr>
+          <w:rFonts w:ascii="Noto Sans KR" w:hAnsi="Noto Sans KR" w:eastAsia="Noto Sans KR" w:cs="Noto Sans KR"/>
+          <w:b w:val="0"/>
+          <w:i w:val="0"/>
+          <w:sz w:val="22"/>
+        </w:rPr>
+        <w:t>¿Todo todo?</w:t>
+      </w:r>
+    </w:p>
+    <w:p>
+      <w:pPr>
+        <w:spacing w:before="0" w:after="40" w:line="276" w:lineRule="auto"/>
+        <w:ind w:left="595"/>
+      </w:pPr>
+      <w:r>
+        <w:rPr>
+          <w:rFonts w:ascii="Noto Sans KR" w:hAnsi="Noto Sans KR" w:eastAsia="Noto Sans KR" w:cs="Noto Sans KR"/>
+          <w:b w:val="0"/>
+          <w:i w:val="0"/>
+          <w:color w:val="555555"/>
+          <w:sz w:val="19"/>
+        </w:rPr>
+        <w:t>전부 다요?</w:t>
+      </w:r>
+    </w:p>
+    <w:p>
+      <w:pPr>
+        <w:keepNext/>
+        <w:spacing w:before="80" w:after="0" w:line="276" w:lineRule="auto"/>
+        <w:ind w:left="0"/>
+      </w:pPr>
+      <w:r>
+        <w:rPr>
+          <w:rFonts w:ascii="Noto Sans KR" w:hAnsi="Noto Sans KR" w:eastAsia="Noto Sans KR" w:cs="Noto Sans KR"/>
+          <w:b w:val="0"/>
+          <w:i w:val="0"/>
+          <w:color w:val="555555"/>
+          <w:sz w:val="15"/>
+        </w:rPr>
+        <w:t xml:space="preserve">039  </w:t>
+      </w:r>
+      <w:r>
+        <w:rPr>
+          <w:rFonts w:ascii="Noto Sans KR" w:hAnsi="Noto Sans KR" w:eastAsia="Noto Sans KR" w:cs="Noto Sans KR"/>
+          <w:b/>
+          <w:i w:val="0"/>
+          <w:color w:val="8A1C2B"/>
+          <w:sz w:val="21"/>
+        </w:rPr>
+        <w:t xml:space="preserve">ÁLVARO   </w:t>
+      </w:r>
+      <w:r>
+        <w:rPr>
+          <w:rFonts w:ascii="Noto Sans KR" w:hAnsi="Noto Sans KR" w:eastAsia="Noto Sans KR" w:cs="Noto Sans KR"/>
+          <w:b w:val="0"/>
+          <w:i w:val="0"/>
+          <w:sz w:val="22"/>
+        </w:rPr>
+        <w:t>Todo lo que esté a la vista. Y si no está a la vista, quiero saber por qué.</w:t>
+      </w:r>
+    </w:p>
+    <w:p>
+      <w:pPr>
+        <w:spacing w:before="0" w:after="40" w:line="276" w:lineRule="auto"/>
+        <w:ind w:left="595"/>
+      </w:pPr>
+      <w:r>
+        <w:rPr>
+          <w:rFonts w:ascii="Noto Sans KR" w:hAnsi="Noto Sans KR" w:eastAsia="Noto Sans KR" w:cs="Noto Sans KR"/>
+          <w:b w:val="0"/>
+          <w:i w:val="0"/>
+          <w:color w:val="555555"/>
+          <w:sz w:val="19"/>
+        </w:rPr>
         <w:t>눈에 보이는 건 전부. 그리고 안 보이는 게 있으면, 왜 안 보이는지 알고 싶어.</w:t>
       </w:r>
     </w:p>
@@ -2222,6 +2430,58 @@
           <w:sz w:val="19"/>
         </w:rPr>
         <w:t>주석 · 표현 노트</w:t>
+      </w:r>
+    </w:p>
+    <w:p>
+      <w:pPr>
+        <w:spacing w:before="0" w:after="0" w:line="276" w:lineRule="auto"/>
+        <w:ind w:left="170"/>
+        <w:shd w:val="clear" w:color="auto" w:fill="EEF1F7"/>
+      </w:pPr>
+      <w:r>
+        <w:rPr>
+          <w:rFonts w:ascii="Noto Sans KR" w:hAnsi="Noto Sans KR" w:eastAsia="Noto Sans KR" w:cs="Noto Sans KR"/>
+          <w:b/>
+          <w:i w:val="0"/>
+          <w:sz w:val="19"/>
+        </w:rPr>
+        <w:t>• crisis del Estai (1995)</w:t>
+      </w:r>
+      <w:r>
+        <w:rPr>
+          <w:rFonts w:ascii="Noto Sans KR" w:hAnsi="Noto Sans KR" w:eastAsia="Noto Sans KR" w:cs="Noto Sans KR"/>
+          <w:b w:val="0"/>
+          <w:i w:val="0"/>
+          <w:color w:val="555555"/>
+          <w:sz w:val="19"/>
+        </w:rPr>
+        <w:t xml:space="preserve">  —  캐나다가 갈리시아 선적 트롤선 Estai를 국제 해역에서 나포한 사건. 스페인 단독이 아니라 EU–캐나다 합의(관측원 승선 등)로 풀렸다. 이 화의 해법 방향(청구서가 아니라 틀을 바꾼다)의 역사적 논거</w:t>
+      </w:r>
+    </w:p>
+    <w:p>
+      <w:pPr>
+        <w:spacing w:before="0" w:after="0" w:line="276" w:lineRule="auto"/>
+        <w:ind w:left="170"/>
+        <w:shd w:val="clear" w:color="auto" w:fill="EEF1F7"/>
+      </w:pPr>
+      <w:r>
+        <w:rPr>
+          <w:rFonts w:ascii="Noto Sans KR" w:hAnsi="Noto Sans KR" w:eastAsia="Noto Sans KR" w:cs="Noto Sans KR"/>
+          <w:b/>
+          <w:i w:val="0"/>
+          <w:sz w:val="19"/>
+        </w:rPr>
+        <w:t>• cambiar el marco</w:t>
+      </w:r>
+      <w:r>
+        <w:rPr>
+          <w:rFonts w:ascii="Noto Sans KR" w:hAnsi="Noto Sans KR" w:eastAsia="Noto Sans KR" w:cs="Noto Sans KR"/>
+          <w:b w:val="0"/>
+          <w:i w:val="0"/>
+          <w:color w:val="555555"/>
+          <w:sz w:val="19"/>
+        </w:rPr>
+        <w:t xml:space="preserve">  —  틀을 바꾸다. 협상에서 '쟁점이 놓인 구조'를 바꾼다는 뜻의 핵심 표현</w:t>
       </w:r>
     </w:p>
     <w:p>
@@ -2412,7 +2672,7 @@
           <w:color w:val="555555"/>
           <w:sz w:val="15"/>
         </w:rPr>
-        <w:t xml:space="preserve">036  </w:t>
+        <w:t xml:space="preserve">040  </w:t>
       </w:r>
       <w:r>
         <w:rPr>
@@ -2464,7 +2724,7 @@
           <w:color w:val="555555"/>
           <w:sz w:val="15"/>
         </w:rPr>
-        <w:t xml:space="preserve">037  </w:t>
+        <w:t xml:space="preserve">041  </w:t>
       </w:r>
       <w:r>
         <w:rPr>
@@ -2516,7 +2776,7 @@
           <w:color w:val="555555"/>
           <w:sz w:val="15"/>
         </w:rPr>
-        <w:t xml:space="preserve">038  </w:t>
+        <w:t xml:space="preserve">042  </w:t>
       </w:r>
       <w:r>
         <w:rPr>
@@ -2568,7 +2828,7 @@
           <w:color w:val="555555"/>
           <w:sz w:val="15"/>
         </w:rPr>
-        <w:t xml:space="preserve">039  </w:t>
+        <w:t xml:space="preserve">043  </w:t>
       </w:r>
       <w:r>
         <w:rPr>
@@ -2620,7 +2880,7 @@
           <w:color w:val="555555"/>
           <w:sz w:val="15"/>
         </w:rPr>
-        <w:t xml:space="preserve">040  </w:t>
+        <w:t xml:space="preserve">044  </w:t>
       </w:r>
       <w:r>
         <w:rPr>
@@ -2672,7 +2932,7 @@
           <w:color w:val="555555"/>
           <w:sz w:val="15"/>
         </w:rPr>
-        <w:t xml:space="preserve">041  </w:t>
+        <w:t xml:space="preserve">045  </w:t>
       </w:r>
       <w:r>
         <w:rPr>
@@ -2724,7 +2984,7 @@
           <w:color w:val="555555"/>
           <w:sz w:val="15"/>
         </w:rPr>
-        <w:t xml:space="preserve">042  </w:t>
+        <w:t xml:space="preserve">046  </w:t>
       </w:r>
       <w:r>
         <w:rPr>
@@ -2776,7 +3036,7 @@
           <w:color w:val="555555"/>
           <w:sz w:val="15"/>
         </w:rPr>
-        <w:t xml:space="preserve">043  </w:t>
+        <w:t xml:space="preserve">047  </w:t>
       </w:r>
       <w:r>
         <w:rPr>
@@ -2828,7 +3088,7 @@
           <w:color w:val="555555"/>
           <w:sz w:val="15"/>
         </w:rPr>
-        <w:t xml:space="preserve">044  </w:t>
+        <w:t xml:space="preserve">048  </w:t>
       </w:r>
       <w:r>
         <w:rPr>
@@ -2880,7 +3140,7 @@
           <w:color w:val="555555"/>
           <w:sz w:val="15"/>
         </w:rPr>
-        <w:t xml:space="preserve">045  </w:t>
+        <w:t xml:space="preserve">049  </w:t>
       </w:r>
       <w:r>
         <w:rPr>
@@ -2932,7 +3192,7 @@
           <w:color w:val="555555"/>
           <w:sz w:val="15"/>
         </w:rPr>
-        <w:t xml:space="preserve">046  </w:t>
+        <w:t xml:space="preserve">050  </w:t>
       </w:r>
       <w:r>
         <w:rPr>
@@ -2984,7 +3244,7 @@
           <w:color w:val="555555"/>
           <w:sz w:val="15"/>
         </w:rPr>
-        <w:t xml:space="preserve">047  </w:t>
+        <w:t xml:space="preserve">051  </w:t>
       </w:r>
       <w:r>
         <w:rPr>
@@ -3036,7 +3296,7 @@
           <w:color w:val="555555"/>
           <w:sz w:val="15"/>
         </w:rPr>
-        <w:t xml:space="preserve">048  </w:t>
+        <w:t xml:space="preserve">052  </w:t>
       </w:r>
       <w:r>
         <w:rPr>
@@ -3088,7 +3348,7 @@
           <w:color w:val="555555"/>
           <w:sz w:val="15"/>
         </w:rPr>
-        <w:t xml:space="preserve">049  </w:t>
+        <w:t xml:space="preserve">053  </w:t>
       </w:r>
       <w:r>
         <w:rPr>
@@ -3140,7 +3400,7 @@
           <w:color w:val="555555"/>
           <w:sz w:val="15"/>
         </w:rPr>
-        <w:t xml:space="preserve">050  </w:t>
+        <w:t xml:space="preserve">054  </w:t>
       </w:r>
       <w:r>
         <w:rPr>
@@ -3192,7 +3452,7 @@
           <w:color w:val="555555"/>
           <w:sz w:val="15"/>
         </w:rPr>
-        <w:t xml:space="preserve">051  </w:t>
+        <w:t xml:space="preserve">055  </w:t>
       </w:r>
       <w:r>
         <w:rPr>
@@ -3244,7 +3504,7 @@
           <w:color w:val="555555"/>
           <w:sz w:val="15"/>
         </w:rPr>
-        <w:t xml:space="preserve">052  </w:t>
+        <w:t xml:space="preserve">056  </w:t>
       </w:r>
       <w:r>
         <w:rPr>
@@ -3296,7 +3556,7 @@
           <w:color w:val="555555"/>
           <w:sz w:val="15"/>
         </w:rPr>
-        <w:t xml:space="preserve">053  </w:t>
+        <w:t xml:space="preserve">057  </w:t>
       </w:r>
       <w:r>
         <w:rPr>
@@ -3348,7 +3608,7 @@
           <w:color w:val="555555"/>
           <w:sz w:val="15"/>
         </w:rPr>
-        <w:t xml:space="preserve">054  </w:t>
+        <w:t xml:space="preserve">058  </w:t>
       </w:r>
       <w:r>
         <w:rPr>
@@ -3400,7 +3660,7 @@
           <w:color w:val="555555"/>
           <w:sz w:val="15"/>
         </w:rPr>
-        <w:t xml:space="preserve">055  </w:t>
+        <w:t xml:space="preserve">059  </w:t>
       </w:r>
       <w:r>
         <w:rPr>
@@ -3452,7 +3712,7 @@
           <w:color w:val="555555"/>
           <w:sz w:val="15"/>
         </w:rPr>
-        <w:t xml:space="preserve">056  </w:t>
+        <w:t xml:space="preserve">060  </w:t>
       </w:r>
       <w:r>
         <w:rPr>
@@ -3504,7 +3764,7 @@
           <w:color w:val="555555"/>
           <w:sz w:val="15"/>
         </w:rPr>
-        <w:t xml:space="preserve">057  </w:t>
+        <w:t xml:space="preserve">061  </w:t>
       </w:r>
       <w:r>
         <w:rPr>
@@ -3556,7 +3816,7 @@
           <w:color w:val="555555"/>
           <w:sz w:val="15"/>
         </w:rPr>
-        <w:t xml:space="preserve">058  </w:t>
+        <w:t xml:space="preserve">062  </w:t>
       </w:r>
       <w:r>
         <w:rPr>
@@ -3608,7 +3868,7 @@
           <w:color w:val="555555"/>
           <w:sz w:val="15"/>
         </w:rPr>
-        <w:t xml:space="preserve">059  </w:t>
+        <w:t xml:space="preserve">063  </w:t>
       </w:r>
       <w:r>
         <w:rPr>
@@ -3660,7 +3920,7 @@
           <w:color w:val="555555"/>
           <w:sz w:val="15"/>
         </w:rPr>
-        <w:t xml:space="preserve">060  </w:t>
+        <w:t xml:space="preserve">064  </w:t>
       </w:r>
       <w:r>
         <w:rPr>
@@ -3712,7 +3972,7 @@
           <w:color w:val="555555"/>
           <w:sz w:val="15"/>
         </w:rPr>
-        <w:t xml:space="preserve">061  </w:t>
+        <w:t xml:space="preserve">065  </w:t>
       </w:r>
       <w:r>
         <w:rPr>
@@ -3764,7 +4024,7 @@
           <w:color w:val="555555"/>
           <w:sz w:val="15"/>
         </w:rPr>
-        <w:t xml:space="preserve">062  </w:t>
+        <w:t xml:space="preserve">066  </w:t>
       </w:r>
       <w:r>
         <w:rPr>
@@ -3816,7 +4076,7 @@
           <w:color w:val="555555"/>
           <w:sz w:val="15"/>
         </w:rPr>
-        <w:t xml:space="preserve">063  </w:t>
+        <w:t xml:space="preserve">067  </w:t>
       </w:r>
       <w:r>
         <w:rPr>
@@ -3868,7 +4128,7 @@
           <w:color w:val="555555"/>
           <w:sz w:val="15"/>
         </w:rPr>
-        <w:t xml:space="preserve">064  </w:t>
+        <w:t xml:space="preserve">068  </w:t>
       </w:r>
       <w:r>
         <w:rPr>
@@ -3920,7 +4180,7 @@
           <w:color w:val="555555"/>
           <w:sz w:val="15"/>
         </w:rPr>
-        <w:t xml:space="preserve">065  </w:t>
+        <w:t xml:space="preserve">069  </w:t>
       </w:r>
       <w:r>
         <w:rPr>
@@ -3972,7 +4232,7 @@
           <w:color w:val="555555"/>
           <w:sz w:val="15"/>
         </w:rPr>
-        <w:t xml:space="preserve">066  </w:t>
+        <w:t xml:space="preserve">070  </w:t>
       </w:r>
       <w:r>
         <w:rPr>
@@ -4024,7 +4284,7 @@
           <w:color w:val="555555"/>
           <w:sz w:val="15"/>
         </w:rPr>
-        <w:t xml:space="preserve">067  </w:t>
+        <w:t xml:space="preserve">071  </w:t>
       </w:r>
       <w:r>
         <w:rPr>
@@ -4076,7 +4336,7 @@
           <w:color w:val="555555"/>
           <w:sz w:val="15"/>
         </w:rPr>
-        <w:t xml:space="preserve">068  </w:t>
+        <w:t xml:space="preserve">072  </w:t>
       </w:r>
       <w:r>
         <w:rPr>
@@ -4128,7 +4388,7 @@
           <w:color w:val="555555"/>
           <w:sz w:val="15"/>
         </w:rPr>
-        <w:t xml:space="preserve">069  </w:t>
+        <w:t xml:space="preserve">073  </w:t>
       </w:r>
       <w:r>
         <w:rPr>
@@ -4180,7 +4440,7 @@
           <w:color w:val="555555"/>
           <w:sz w:val="15"/>
         </w:rPr>
-        <w:t xml:space="preserve">070  </w:t>
+        <w:t xml:space="preserve">074  </w:t>
       </w:r>
       <w:r>
         <w:rPr>
@@ -4232,7 +4492,7 @@
           <w:color w:val="555555"/>
           <w:sz w:val="15"/>
         </w:rPr>
-        <w:t xml:space="preserve">071  </w:t>
+        <w:t xml:space="preserve">075  </w:t>
       </w:r>
       <w:r>
         <w:rPr>
@@ -4284,7 +4544,7 @@
           <w:color w:val="555555"/>
           <w:sz w:val="15"/>
         </w:rPr>
-        <w:t xml:space="preserve">072  </w:t>
+        <w:t xml:space="preserve">076  </w:t>
       </w:r>
       <w:r>
         <w:rPr>
@@ -4526,7 +4786,7 @@
           <w:color w:val="555555"/>
           <w:sz w:val="15"/>
         </w:rPr>
-        <w:t xml:space="preserve">073  </w:t>
+        <w:t xml:space="preserve">077  </w:t>
       </w:r>
       <w:r>
         <w:rPr>
@@ -4545,7 +4805,7 @@
           <w:i w:val="0"/>
           <w:sz w:val="22"/>
         </w:rPr>
-        <w:t>¿Usted es el señor del Ministerio? Llevamos cuatro días esperando que alguien se digne a venir.</w:t>
+        <w:t>¿Usted es el señor del Ministerio? Llevamos tres días esperando que alguien se digne a venir.</w:t>
       </w:r>
     </w:p>
     <w:p>
@@ -4561,7 +4821,7 @@
           <w:color w:val="555555"/>
           <w:sz w:val="19"/>
         </w:rPr>
-        <w:t>외교부에서 오신 분이세요? 누군가 와 주기만을 나흘째 기다렸어요.</w:t>
+        <w:t>외교부에서 오신 분이세요? 누군가 와 주기만을 사흘째 기다렸어요.</w:t>
       </w:r>
     </w:p>
     <w:p>
@@ -4578,7 +4838,7 @@
           <w:color w:val="555555"/>
           <w:sz w:val="15"/>
         </w:rPr>
-        <w:t xml:space="preserve">074  </w:t>
+        <w:t xml:space="preserve">078  </w:t>
       </w:r>
       <w:r>
         <w:rPr>
@@ -4630,7 +4890,7 @@
           <w:color w:val="555555"/>
           <w:sz w:val="15"/>
         </w:rPr>
-        <w:t xml:space="preserve">075  </w:t>
+        <w:t xml:space="preserve">079  </w:t>
       </w:r>
       <w:r>
         <w:rPr>
@@ -4682,7 +4942,7 @@
           <w:color w:val="555555"/>
           <w:sz w:val="15"/>
         </w:rPr>
-        <w:t xml:space="preserve">076  </w:t>
+        <w:t xml:space="preserve">080  </w:t>
       </w:r>
       <w:r>
         <w:rPr>
@@ -4734,7 +4994,7 @@
           <w:color w:val="555555"/>
           <w:sz w:val="15"/>
         </w:rPr>
-        <w:t xml:space="preserve">077  </w:t>
+        <w:t xml:space="preserve">081  </w:t>
       </w:r>
       <w:r>
         <w:rPr>
@@ -4786,7 +5046,7 @@
           <w:color w:val="555555"/>
           <w:sz w:val="15"/>
         </w:rPr>
-        <w:t xml:space="preserve">078  </w:t>
+        <w:t xml:space="preserve">082  </w:t>
       </w:r>
       <w:r>
         <w:rPr>
@@ -4838,7 +5098,7 @@
           <w:color w:val="555555"/>
           <w:sz w:val="15"/>
         </w:rPr>
-        <w:t xml:space="preserve">079  </w:t>
+        <w:t xml:space="preserve">083  </w:t>
       </w:r>
       <w:r>
         <w:rPr>
@@ -4890,7 +5150,7 @@
           <w:color w:val="555555"/>
           <w:sz w:val="15"/>
         </w:rPr>
-        <w:t xml:space="preserve">080  </w:t>
+        <w:t xml:space="preserve">084  </w:t>
       </w:r>
       <w:r>
         <w:rPr>
@@ -4942,7 +5202,7 @@
           <w:color w:val="555555"/>
           <w:sz w:val="15"/>
         </w:rPr>
-        <w:t xml:space="preserve">081  </w:t>
+        <w:t xml:space="preserve">085  </w:t>
       </w:r>
       <w:r>
         <w:rPr>
@@ -4994,7 +5254,7 @@
           <w:color w:val="555555"/>
           <w:sz w:val="15"/>
         </w:rPr>
-        <w:t xml:space="preserve">082  </w:t>
+        <w:t xml:space="preserve">086  </w:t>
       </w:r>
       <w:r>
         <w:rPr>
@@ -5046,7 +5306,7 @@
           <w:color w:val="555555"/>
           <w:sz w:val="15"/>
         </w:rPr>
-        <w:t xml:space="preserve">083  </w:t>
+        <w:t xml:space="preserve">087  </w:t>
       </w:r>
       <w:r>
         <w:rPr>
@@ -5098,7 +5358,7 @@
           <w:color w:val="555555"/>
           <w:sz w:val="15"/>
         </w:rPr>
-        <w:t xml:space="preserve">084  </w:t>
+        <w:t xml:space="preserve">088  </w:t>
       </w:r>
       <w:r>
         <w:rPr>
@@ -5150,7 +5410,7 @@
           <w:color w:val="555555"/>
           <w:sz w:val="15"/>
         </w:rPr>
-        <w:t xml:space="preserve">085  </w:t>
+        <w:t xml:space="preserve">089  </w:t>
       </w:r>
       <w:r>
         <w:rPr>
@@ -5202,7 +5462,7 @@
           <w:color w:val="555555"/>
           <w:sz w:val="15"/>
         </w:rPr>
-        <w:t xml:space="preserve">086  </w:t>
+        <w:t xml:space="preserve">090  </w:t>
       </w:r>
       <w:r>
         <w:rPr>
@@ -5254,7 +5514,7 @@
           <w:color w:val="555555"/>
           <w:sz w:val="15"/>
         </w:rPr>
-        <w:t xml:space="preserve">087  </w:t>
+        <w:t xml:space="preserve">091  </w:t>
       </w:r>
       <w:r>
         <w:rPr>
@@ -5306,7 +5566,7 @@
           <w:color w:val="555555"/>
           <w:sz w:val="15"/>
         </w:rPr>
-        <w:t xml:space="preserve">088  </w:t>
+        <w:t xml:space="preserve">092  </w:t>
       </w:r>
       <w:r>
         <w:rPr>
@@ -5358,7 +5618,7 @@
           <w:color w:val="555555"/>
           <w:sz w:val="15"/>
         </w:rPr>
-        <w:t xml:space="preserve">089  </w:t>
+        <w:t xml:space="preserve">093  </w:t>
       </w:r>
       <w:r>
         <w:rPr>
@@ -5410,7 +5670,7 @@
           <w:color w:val="555555"/>
           <w:sz w:val="15"/>
         </w:rPr>
-        <w:t xml:space="preserve">090  </w:t>
+        <w:t xml:space="preserve">094  </w:t>
       </w:r>
       <w:r>
         <w:rPr>
@@ -5462,7 +5722,7 @@
           <w:color w:val="555555"/>
           <w:sz w:val="15"/>
         </w:rPr>
-        <w:t xml:space="preserve">091  </w:t>
+        <w:t xml:space="preserve">095  </w:t>
       </w:r>
       <w:r>
         <w:rPr>
@@ -5514,7 +5774,7 @@
           <w:color w:val="555555"/>
           <w:sz w:val="15"/>
         </w:rPr>
-        <w:t xml:space="preserve">092  </w:t>
+        <w:t xml:space="preserve">096  </w:t>
       </w:r>
       <w:r>
         <w:rPr>
@@ -5566,7 +5826,7 @@
           <w:color w:val="555555"/>
           <w:sz w:val="15"/>
         </w:rPr>
-        <w:t xml:space="preserve">093  </w:t>
+        <w:t xml:space="preserve">097  </w:t>
       </w:r>
       <w:r>
         <w:rPr>
@@ -5618,7 +5878,7 @@
           <w:color w:val="555555"/>
           <w:sz w:val="15"/>
         </w:rPr>
-        <w:t xml:space="preserve">094  </w:t>
+        <w:t xml:space="preserve">098  </w:t>
       </w:r>
       <w:r>
         <w:rPr>
@@ -5670,7 +5930,7 @@
           <w:color w:val="555555"/>
           <w:sz w:val="15"/>
         </w:rPr>
-        <w:t xml:space="preserve">095  </w:t>
+        <w:t xml:space="preserve">099  </w:t>
       </w:r>
       <w:r>
         <w:rPr>
@@ -5722,7 +5982,7 @@
           <w:color w:val="555555"/>
           <w:sz w:val="15"/>
         </w:rPr>
-        <w:t xml:space="preserve">096  </w:t>
+        <w:t xml:space="preserve">100  </w:t>
       </w:r>
       <w:r>
         <w:rPr>
@@ -5774,7 +6034,7 @@
           <w:color w:val="555555"/>
           <w:sz w:val="15"/>
         </w:rPr>
-        <w:t xml:space="preserve">097  </w:t>
+        <w:t xml:space="preserve">101  </w:t>
       </w:r>
       <w:r>
         <w:rPr>
@@ -5826,7 +6086,7 @@
           <w:color w:val="555555"/>
           <w:sz w:val="15"/>
         </w:rPr>
-        <w:t xml:space="preserve">098  </w:t>
+        <w:t xml:space="preserve">102  </w:t>
       </w:r>
       <w:r>
         <w:rPr>
@@ -5878,7 +6138,7 @@
           <w:color w:val="555555"/>
           <w:sz w:val="15"/>
         </w:rPr>
-        <w:t xml:space="preserve">099  </w:t>
+        <w:t xml:space="preserve">103  </w:t>
       </w:r>
       <w:r>
         <w:rPr>
@@ -5930,7 +6190,7 @@
           <w:color w:val="555555"/>
           <w:sz w:val="15"/>
         </w:rPr>
-        <w:t xml:space="preserve">100  </w:t>
+        <w:t xml:space="preserve">104  </w:t>
       </w:r>
       <w:r>
         <w:rPr>
@@ -5982,7 +6242,7 @@
           <w:color w:val="555555"/>
           <w:sz w:val="15"/>
         </w:rPr>
-        <w:t xml:space="preserve">101  </w:t>
+        <w:t xml:space="preserve">105  </w:t>
       </w:r>
       <w:r>
         <w:rPr>
@@ -6034,7 +6294,7 @@
           <w:color w:val="555555"/>
           <w:sz w:val="15"/>
         </w:rPr>
-        <w:t xml:space="preserve">102  </w:t>
+        <w:t xml:space="preserve">106  </w:t>
       </w:r>
       <w:r>
         <w:rPr>
@@ -6086,7 +6346,7 @@
           <w:color w:val="555555"/>
           <w:sz w:val="15"/>
         </w:rPr>
-        <w:t xml:space="preserve">103  </w:t>
+        <w:t xml:space="preserve">107  </w:t>
       </w:r>
       <w:r>
         <w:rPr>
@@ -6138,7 +6398,7 @@
           <w:color w:val="555555"/>
           <w:sz w:val="15"/>
         </w:rPr>
-        <w:t xml:space="preserve">104  </w:t>
+        <w:t xml:space="preserve">108  </w:t>
       </w:r>
       <w:r>
         <w:rPr>
@@ -6190,7 +6450,7 @@
           <w:color w:val="555555"/>
           <w:sz w:val="15"/>
         </w:rPr>
-        <w:t xml:space="preserve">105  </w:t>
+        <w:t xml:space="preserve">109  </w:t>
       </w:r>
       <w:r>
         <w:rPr>
@@ -6242,7 +6502,7 @@
           <w:color w:val="555555"/>
           <w:sz w:val="15"/>
         </w:rPr>
-        <w:t xml:space="preserve">106  </w:t>
+        <w:t xml:space="preserve">110  </w:t>
       </w:r>
       <w:r>
         <w:rPr>
@@ -6294,7 +6554,7 @@
           <w:color w:val="555555"/>
           <w:sz w:val="15"/>
         </w:rPr>
-        <w:t xml:space="preserve">107  </w:t>
+        <w:t xml:space="preserve">111  </w:t>
       </w:r>
       <w:r>
         <w:rPr>
@@ -6346,7 +6606,7 @@
           <w:color w:val="555555"/>
           <w:sz w:val="15"/>
         </w:rPr>
-        <w:t xml:space="preserve">108  </w:t>
+        <w:t xml:space="preserve">112  </w:t>
       </w:r>
       <w:r>
         <w:rPr>
@@ -6398,7 +6658,7 @@
           <w:color w:val="555555"/>
           <w:sz w:val="15"/>
         </w:rPr>
-        <w:t xml:space="preserve">109  </w:t>
+        <w:t xml:space="preserve">113  </w:t>
       </w:r>
       <w:r>
         <w:rPr>
@@ -6450,7 +6710,7 @@
           <w:color w:val="555555"/>
           <w:sz w:val="15"/>
         </w:rPr>
-        <w:t xml:space="preserve">110  </w:t>
+        <w:t xml:space="preserve">114  </w:t>
       </w:r>
       <w:r>
         <w:rPr>
@@ -6502,7 +6762,7 @@
           <w:color w:val="555555"/>
           <w:sz w:val="15"/>
         </w:rPr>
-        <w:t xml:space="preserve">111  </w:t>
+        <w:t xml:space="preserve">115  </w:t>
       </w:r>
       <w:r>
         <w:rPr>
@@ -6554,7 +6814,7 @@
           <w:color w:val="555555"/>
           <w:sz w:val="15"/>
         </w:rPr>
-        <w:t xml:space="preserve">112  </w:t>
+        <w:t xml:space="preserve">116  </w:t>
       </w:r>
       <w:r>
         <w:rPr>
@@ -6606,7 +6866,7 @@
           <w:color w:val="555555"/>
           <w:sz w:val="15"/>
         </w:rPr>
-        <w:t xml:space="preserve">113  </w:t>
+        <w:t xml:space="preserve">117  </w:t>
       </w:r>
       <w:r>
         <w:rPr>
@@ -6658,7 +6918,7 @@
           <w:color w:val="555555"/>
           <w:sz w:val="15"/>
         </w:rPr>
-        <w:t xml:space="preserve">114  </w:t>
+        <w:t xml:space="preserve">118  </w:t>
       </w:r>
       <w:r>
         <w:rPr>
@@ -6710,7 +6970,7 @@
           <w:color w:val="555555"/>
           <w:sz w:val="15"/>
         </w:rPr>
-        <w:t xml:space="preserve">115  </w:t>
+        <w:t xml:space="preserve">119  </w:t>
       </w:r>
       <w:r>
         <w:rPr>
@@ -6762,7 +7022,7 @@
           <w:color w:val="555555"/>
           <w:sz w:val="15"/>
         </w:rPr>
-        <w:t xml:space="preserve">116  </w:t>
+        <w:t xml:space="preserve">120  </w:t>
       </w:r>
       <w:r>
         <w:rPr>
@@ -6781,7 +7041,7 @@
           <w:i w:val="0"/>
           <w:sz w:val="22"/>
         </w:rPr>
-        <w:t>Chano, acaba usted de explicarme en diez segundos lo que me han estado diciendo tres días. Cambio y cierro.</w:t>
+        <w:t>Chano, acaba usted de explicarme en diez segundos lo que me han estado diciendo estos días. Cambio y cierro.</w:t>
       </w:r>
     </w:p>
     <w:p>
@@ -6797,7 +7057,7 @@
           <w:color w:val="555555"/>
           <w:sz w:val="19"/>
         </w:rPr>
-        <w:t>차노 씨, 사흘 동안 다들 제게 말해 준 걸 방금 10초 만에 설명하셨습니다. 오버, 교신 종료합니다.</w:t>
+        <w:t>차노 씨, 며칠 동안 다들 제게 말해 준 걸 방금 10초 만에 설명하셨습니다. 오버, 교신 종료합니다.</w:t>
       </w:r>
     </w:p>
     <w:p>
@@ -6814,7 +7074,7 @@
           <w:color w:val="555555"/>
           <w:sz w:val="15"/>
         </w:rPr>
-        <w:t xml:space="preserve">117  </w:t>
+        <w:t xml:space="preserve">121  </w:t>
       </w:r>
       <w:r>
         <w:rPr>
@@ -6866,7 +7126,7 @@
           <w:color w:val="555555"/>
           <w:sz w:val="15"/>
         </w:rPr>
-        <w:t xml:space="preserve">118  </w:t>
+        <w:t xml:space="preserve">122  </w:t>
       </w:r>
       <w:r>
         <w:rPr>
@@ -6918,7 +7178,7 @@
           <w:color w:val="555555"/>
           <w:sz w:val="15"/>
         </w:rPr>
-        <w:t xml:space="preserve">119  </w:t>
+        <w:t xml:space="preserve">123  </w:t>
       </w:r>
       <w:r>
         <w:rPr>
@@ -6970,7 +7230,7 @@
           <w:color w:val="555555"/>
           <w:sz w:val="15"/>
         </w:rPr>
-        <w:t xml:space="preserve">120  </w:t>
+        <w:t xml:space="preserve">124  </w:t>
       </w:r>
       <w:r>
         <w:rPr>
@@ -7022,7 +7282,7 @@
           <w:color w:val="555555"/>
           <w:sz w:val="15"/>
         </w:rPr>
-        <w:t xml:space="preserve">121  </w:t>
+        <w:t xml:space="preserve">125  </w:t>
       </w:r>
       <w:r>
         <w:rPr>
@@ -7074,7 +7334,7 @@
           <w:color w:val="555555"/>
           <w:sz w:val="15"/>
         </w:rPr>
-        <w:t xml:space="preserve">122  </w:t>
+        <w:t xml:space="preserve">126  </w:t>
       </w:r>
       <w:r>
         <w:rPr>
@@ -7126,7 +7386,7 @@
           <w:color w:val="555555"/>
           <w:sz w:val="15"/>
         </w:rPr>
-        <w:t xml:space="preserve">123  </w:t>
+        <w:t xml:space="preserve">127  </w:t>
       </w:r>
       <w:r>
         <w:rPr>
@@ -7178,7 +7438,7 @@
           <w:color w:val="555555"/>
           <w:sz w:val="15"/>
         </w:rPr>
-        <w:t xml:space="preserve">124  </w:t>
+        <w:t xml:space="preserve">128  </w:t>
       </w:r>
       <w:r>
         <w:rPr>
@@ -7230,7 +7490,7 @@
           <w:color w:val="555555"/>
           <w:sz w:val="15"/>
         </w:rPr>
-        <w:t xml:space="preserve">125  </w:t>
+        <w:t xml:space="preserve">129  </w:t>
       </w:r>
       <w:r>
         <w:rPr>
@@ -7282,7 +7542,7 @@
           <w:color w:val="555555"/>
           <w:sz w:val="15"/>
         </w:rPr>
-        <w:t xml:space="preserve">126  </w:t>
+        <w:t xml:space="preserve">130  </w:t>
       </w:r>
       <w:r>
         <w:rPr>
@@ -7334,7 +7594,7 @@
           <w:color w:val="555555"/>
           <w:sz w:val="15"/>
         </w:rPr>
-        <w:t xml:space="preserve">127  </w:t>
+        <w:t xml:space="preserve">131  </w:t>
       </w:r>
       <w:r>
         <w:rPr>
@@ -7353,7 +7613,7 @@
           <w:i w:val="0"/>
           <w:sz w:val="22"/>
         </w:rPr>
-        <w:t>Eso es lo más claro que me han dicho en cuatro días.</w:t>
+        <w:t>Eso es lo más claro que me han dicho en tres días.</w:t>
       </w:r>
     </w:p>
     <w:p>
@@ -7369,7 +7629,7 @@
           <w:color w:val="555555"/>
           <w:sz w:val="19"/>
         </w:rPr>
-        <w:t>나흘 동안 들은 말 중에서 제일 분명하네요.</w:t>
+        <w:t>사흘 동안 들은 말 중에서 제일 분명하네요.</w:t>
       </w:r>
     </w:p>
     <w:p>
@@ -7386,7 +7646,7 @@
           <w:color w:val="555555"/>
           <w:sz w:val="15"/>
         </w:rPr>
-        <w:t xml:space="preserve">128  </w:t>
+        <w:t xml:space="preserve">132  </w:t>
       </w:r>
       <w:r>
         <w:rPr>
@@ -7628,7 +7888,7 @@
           <w:color w:val="555555"/>
           <w:sz w:val="15"/>
         </w:rPr>
-        <w:t xml:space="preserve">129  </w:t>
+        <w:t xml:space="preserve">133  </w:t>
       </w:r>
       <w:r>
         <w:rPr>
@@ -7680,7 +7940,7 @@
           <w:color w:val="555555"/>
           <w:sz w:val="15"/>
         </w:rPr>
-        <w:t xml:space="preserve">130  </w:t>
+        <w:t xml:space="preserve">134  </w:t>
       </w:r>
       <w:r>
         <w:rPr>
@@ -7732,7 +7992,7 @@
           <w:color w:val="555555"/>
           <w:sz w:val="15"/>
         </w:rPr>
-        <w:t xml:space="preserve">131  </w:t>
+        <w:t xml:space="preserve">135  </w:t>
       </w:r>
       <w:r>
         <w:rPr>
@@ -7784,7 +8044,7 @@
           <w:color w:val="555555"/>
           <w:sz w:val="15"/>
         </w:rPr>
-        <w:t xml:space="preserve">132  </w:t>
+        <w:t xml:space="preserve">136  </w:t>
       </w:r>
       <w:r>
         <w:rPr>
@@ -7836,7 +8096,7 @@
           <w:color w:val="555555"/>
           <w:sz w:val="15"/>
         </w:rPr>
-        <w:t xml:space="preserve">133  </w:t>
+        <w:t xml:space="preserve">137  </w:t>
       </w:r>
       <w:r>
         <w:rPr>
@@ -7888,7 +8148,7 @@
           <w:color w:val="555555"/>
           <w:sz w:val="15"/>
         </w:rPr>
-        <w:t xml:space="preserve">134  </w:t>
+        <w:t xml:space="preserve">138  </w:t>
       </w:r>
       <w:r>
         <w:rPr>
@@ -7940,7 +8200,7 @@
           <w:color w:val="555555"/>
           <w:sz w:val="15"/>
         </w:rPr>
-        <w:t xml:space="preserve">135  </w:t>
+        <w:t xml:space="preserve">139  </w:t>
       </w:r>
       <w:r>
         <w:rPr>
@@ -7992,7 +8252,7 @@
           <w:color w:val="555555"/>
           <w:sz w:val="15"/>
         </w:rPr>
-        <w:t xml:space="preserve">136  </w:t>
+        <w:t xml:space="preserve">140  </w:t>
       </w:r>
       <w:r>
         <w:rPr>
@@ -8044,7 +8304,7 @@
           <w:color w:val="555555"/>
           <w:sz w:val="15"/>
         </w:rPr>
-        <w:t xml:space="preserve">137  </w:t>
+        <w:t xml:space="preserve">141  </w:t>
       </w:r>
       <w:r>
         <w:rPr>
@@ -8096,7 +8356,7 @@
           <w:color w:val="555555"/>
           <w:sz w:val="15"/>
         </w:rPr>
-        <w:t xml:space="preserve">138  </w:t>
+        <w:t xml:space="preserve">142  </w:t>
       </w:r>
       <w:r>
         <w:rPr>
@@ -8148,7 +8408,7 @@
           <w:color w:val="555555"/>
           <w:sz w:val="15"/>
         </w:rPr>
-        <w:t xml:space="preserve">139  </w:t>
+        <w:t xml:space="preserve">143  </w:t>
       </w:r>
       <w:r>
         <w:rPr>
@@ -8200,7 +8460,7 @@
           <w:color w:val="555555"/>
           <w:sz w:val="15"/>
         </w:rPr>
-        <w:t xml:space="preserve">140  </w:t>
+        <w:t xml:space="preserve">144  </w:t>
       </w:r>
       <w:r>
         <w:rPr>
@@ -8252,7 +8512,7 @@
           <w:color w:val="555555"/>
           <w:sz w:val="15"/>
         </w:rPr>
-        <w:t xml:space="preserve">141  </w:t>
+        <w:t xml:space="preserve">145  </w:t>
       </w:r>
       <w:r>
         <w:rPr>
@@ -8304,7 +8564,7 @@
           <w:color w:val="555555"/>
           <w:sz w:val="15"/>
         </w:rPr>
-        <w:t xml:space="preserve">142  </w:t>
+        <w:t xml:space="preserve">146  </w:t>
       </w:r>
       <w:r>
         <w:rPr>
@@ -8356,7 +8616,7 @@
           <w:color w:val="555555"/>
           <w:sz w:val="15"/>
         </w:rPr>
-        <w:t xml:space="preserve">143  </w:t>
+        <w:t xml:space="preserve">147  </w:t>
       </w:r>
       <w:r>
         <w:rPr>
@@ -8408,7 +8668,7 @@
           <w:color w:val="555555"/>
           <w:sz w:val="15"/>
         </w:rPr>
-        <w:t xml:space="preserve">144  </w:t>
+        <w:t xml:space="preserve">148  </w:t>
       </w:r>
       <w:r>
         <w:rPr>
@@ -8460,7 +8720,7 @@
           <w:color w:val="555555"/>
           <w:sz w:val="15"/>
         </w:rPr>
-        <w:t xml:space="preserve">145  </w:t>
+        <w:t xml:space="preserve">149  </w:t>
       </w:r>
       <w:r>
         <w:rPr>
@@ -8512,7 +8772,7 @@
           <w:color w:val="555555"/>
           <w:sz w:val="15"/>
         </w:rPr>
-        <w:t xml:space="preserve">146  </w:t>
+        <w:t xml:space="preserve">150  </w:t>
       </w:r>
       <w:r>
         <w:rPr>
@@ -8564,7 +8824,7 @@
           <w:color w:val="555555"/>
           <w:sz w:val="15"/>
         </w:rPr>
-        <w:t xml:space="preserve">147  </w:t>
+        <w:t xml:space="preserve">151  </w:t>
       </w:r>
       <w:r>
         <w:rPr>
@@ -8634,7 +8894,7 @@
           <w:color w:val="555555"/>
           <w:sz w:val="15"/>
         </w:rPr>
-        <w:t xml:space="preserve">148  </w:t>
+        <w:t xml:space="preserve">152  </w:t>
       </w:r>
       <w:r>
         <w:rPr>
@@ -8686,7 +8946,7 @@
           <w:color w:val="555555"/>
           <w:sz w:val="15"/>
         </w:rPr>
-        <w:t xml:space="preserve">149  </w:t>
+        <w:t xml:space="preserve">153  </w:t>
       </w:r>
       <w:r>
         <w:rPr>
@@ -8738,7 +8998,7 @@
           <w:color w:val="555555"/>
           <w:sz w:val="15"/>
         </w:rPr>
-        <w:t xml:space="preserve">150  </w:t>
+        <w:t xml:space="preserve">154  </w:t>
       </w:r>
       <w:r>
         <w:rPr>
@@ -8790,7 +9050,7 @@
           <w:color w:val="555555"/>
           <w:sz w:val="15"/>
         </w:rPr>
-        <w:t xml:space="preserve">151  </w:t>
+        <w:t xml:space="preserve">155  </w:t>
       </w:r>
       <w:r>
         <w:rPr>
@@ -8842,7 +9102,7 @@
           <w:color w:val="555555"/>
           <w:sz w:val="15"/>
         </w:rPr>
-        <w:t xml:space="preserve">152  </w:t>
+        <w:t xml:space="preserve">156  </w:t>
       </w:r>
       <w:r>
         <w:rPr>
@@ -8894,7 +9154,7 @@
           <w:color w:val="555555"/>
           <w:sz w:val="15"/>
         </w:rPr>
-        <w:t xml:space="preserve">153  </w:t>
+        <w:t xml:space="preserve">157  </w:t>
       </w:r>
       <w:r>
         <w:rPr>
@@ -8946,7 +9206,7 @@
           <w:color w:val="555555"/>
           <w:sz w:val="15"/>
         </w:rPr>
-        <w:t xml:space="preserve">154  </w:t>
+        <w:t xml:space="preserve">158  </w:t>
       </w:r>
       <w:r>
         <w:rPr>
@@ -8998,7 +9258,7 @@
           <w:color w:val="555555"/>
           <w:sz w:val="15"/>
         </w:rPr>
-        <w:t xml:space="preserve">155  </w:t>
+        <w:t xml:space="preserve">159  </w:t>
       </w:r>
       <w:r>
         <w:rPr>
@@ -9050,7 +9310,7 @@
           <w:color w:val="555555"/>
           <w:sz w:val="15"/>
         </w:rPr>
-        <w:t xml:space="preserve">156  </w:t>
+        <w:t xml:space="preserve">160  </w:t>
       </w:r>
       <w:r>
         <w:rPr>
@@ -9102,7 +9362,7 @@
           <w:color w:val="555555"/>
           <w:sz w:val="15"/>
         </w:rPr>
-        <w:t xml:space="preserve">157  </w:t>
+        <w:t xml:space="preserve">161  </w:t>
       </w:r>
       <w:r>
         <w:rPr>
@@ -9154,7 +9414,7 @@
           <w:color w:val="555555"/>
           <w:sz w:val="15"/>
         </w:rPr>
-        <w:t xml:space="preserve">158  </w:t>
+        <w:t xml:space="preserve">162  </w:t>
       </w:r>
       <w:r>
         <w:rPr>
@@ -9206,7 +9466,7 @@
           <w:color w:val="555555"/>
           <w:sz w:val="15"/>
         </w:rPr>
-        <w:t xml:space="preserve">159  </w:t>
+        <w:t xml:space="preserve">163  </w:t>
       </w:r>
       <w:r>
         <w:rPr>
@@ -9258,7 +9518,7 @@
           <w:color w:val="555555"/>
           <w:sz w:val="15"/>
         </w:rPr>
-        <w:t xml:space="preserve">160  </w:t>
+        <w:t xml:space="preserve">164  </w:t>
       </w:r>
       <w:r>
         <w:rPr>
@@ -9310,7 +9570,7 @@
           <w:color w:val="555555"/>
           <w:sz w:val="15"/>
         </w:rPr>
-        <w:t xml:space="preserve">161  </w:t>
+        <w:t xml:space="preserve">165  </w:t>
       </w:r>
       <w:r>
         <w:rPr>

</xml_diff>